<commit_message>
Fill confirmed author affiliations from the ac4aiagents Overleaf bios
Sitharaman: Zetafence, Inc. (Founder and CTO, Dublin, CA). Gupta: Assistant
Professor, Texas A&M University-Central Texas. Source:
ac4aiagents/overleaf_upload/A4IControl_v1374-HSK-07-21/access.tex, which also
carries full IEEEbiography blocks if a journal version needs them. Rawat
appears in that file but is not on the IPCCC author list.

Applied to paper/main.tex (distinct authorrefmarks per affiliation), the
abstract draft doc, project-overview author roles, the scaffold, and the
resume note. Also trued up project-overview lines that still described
paper/ as gitignored, the lost April skeleton as 70% written, and the 3D
synthesis run as cheap and pending.

Remaining author-block open item: how Badawy renders his name on recent
papers.

AI Assistant: Claude Fable 5
</commit_message>
<xml_diff>
--- a/docs/ipccc-2026-manuscript-draft-v1.docx
+++ b/docs/ipccc-2026-manuscript-draft-v1.docx
@@ -129,18 +129,12 @@
         <w:t xml:space="preserve"> </w:t>
       </w:r>
       <w:r>
-        <w:t xml:space="preserve">(National Vulnerability Database 2022a)</w:t>
-      </w:r>
-      <w:r>
         <w:t xml:space="preserve">, and CVE-2021-38425 documents message injection against eProsima Fast DDS, the default ROS 2 transport</w:t>
       </w:r>
       <w:r>
         <w:t xml:space="preserve"> </w:t>
       </w:r>
       <w:r>
-        <w:t xml:space="preserve">(National Vulnerability Database 2021)</w:t>
-      </w:r>
-      <w:r>
         <w:t xml:space="preserve">.</w:t>
       </w:r>
     </w:p>
@@ -163,9 +157,6 @@
         <w:t xml:space="preserve"> </w:t>
       </w:r>
       <w:r>
-        <w:t xml:space="preserve">(Karim, Gupta, et al. 2026)</w:t>
-      </w:r>
-      <w:r>
         <w:t xml:space="preserve">, and a software authorization path that averaged 1.14 </w:t>
       </w:r>
       <m:oMath>
@@ -188,9 +179,6 @@
         <w:t xml:space="preserve"> </w:t>
       </w:r>
       <w:r>
-        <w:t xml:space="preserve">(Karim, Sitharaman, et al. 2026)</w:t>
-      </w:r>
-      <w:r>
         <w:t xml:space="preserve">. A control loop cannot budget for a tail it cannot bound. Thus engineers place authorization at the perimeter and leave the control path open.</w:t>
       </w:r>
     </w:p>
@@ -205,18 +193,12 @@
         <w:t xml:space="preserve"> </w:t>
       </w:r>
       <w:r>
-        <w:t xml:space="preserve">(Sitharaman et al. 2025)</w:t>
-      </w:r>
-      <w:r>
         <w:t xml:space="preserve">, and that insight is the intellectual origin of this work. H-NGAC, presented at IEEE DCAS 2026, carried the idea to the decision path: compile the NGAC policy graph</w:t>
       </w:r>
       <w:r>
         <w:t xml:space="preserve"> </w:t>
       </w:r>
       <w:r>
-        <w:t xml:space="preserve">(InterNational Committee for Information Technology Standards 2020; Ferraiolo et al. 2011)</w:t>
-      </w:r>
-      <w:r>
         <w:t xml:space="preserve"> </w:t>
       </w:r>
       <w:r>
@@ -224,9 +206,6 @@
       </w:r>
       <w:r>
         <w:t xml:space="preserve"> </w:t>
-      </w:r>
-      <w:r>
-        <w:t xml:space="preserve">(Karim, Sitharaman, et al. 2026)</w:t>
       </w:r>
       <w:r>
         <w:t xml:space="preserve">. H-NGAC checked the identity triple of subject, object and attribute. It did not model the platform’s runtime state, and it did not model where a command came from. Layla’s interlock lives in exactly those two missing dimensions.</w:t>
@@ -372,16 +351,10 @@
         <w:t xml:space="preserve"> </w:t>
       </w:r>
       <w:r>
-        <w:t xml:space="preserve">(InterNational Committee for Information Technology Standards 2020; Ferraiolo et al. 2011)</w:t>
-      </w:r>
-      <w:r>
         <w:t xml:space="preserve">. The generality is valuable and the traversal is the cost. H-NGAC compiles the policy graph ahead of time into fixed-width bitmasks so the runtime decision is a chain of AND operations over precomputed sets</w:t>
       </w:r>
       <w:r>
         <w:t xml:space="preserve"> </w:t>
-      </w:r>
-      <w:r>
-        <w:t xml:space="preserve">(Karim, Sitharaman, et al. 2026)</w:t>
       </w:r>
       <w:r>
         <w:t xml:space="preserve">. We refer to the traversal-based reference model as DAG-NGAC throughout. This paper extends H-NGAC and inherits its compilation step unchanged.</w:t>
@@ -426,9 +399,6 @@
         <w:t xml:space="preserve"> </w:t>
       </w:r>
       <w:r>
-        <w:t xml:space="preserve">(National Vulnerability Database 2022b)</w:t>
-      </w:r>
-      <w:r>
         <w:t xml:space="preserve">). The identity triple closes this class, and it is the class every access control model addresses.</w:t>
       </w:r>
     </w:p>
@@ -453,9 +423,6 @@
         <w:t xml:space="preserve"> </w:t>
       </w:r>
       <w:r>
-        <w:t xml:space="preserve">(National Vulnerability Database 2022a)</w:t>
-      </w:r>
-      <w:r>
         <w:t xml:space="preserve">). Identity-based authorization admits this class because the request is legitimate on every identity axis.</w:t>
       </w:r>
     </w:p>
@@ -480,16 +447,10 @@
         <w:t xml:space="preserve"> </w:t>
       </w:r>
       <w:r>
-        <w:t xml:space="preserve">(National Vulnerability Database 2021)</w:t>
-      </w:r>
-      <w:r>
         <w:t xml:space="preserve">). SROS2 and DDS-Security authenticate who a node is at the transport layer</w:t>
       </w:r>
       <w:r>
         <w:t xml:space="preserve"> </w:t>
-      </w:r>
-      <w:r>
-        <w:t xml:space="preserve">(Mayoral-Vilches et al. 2022; Object Management Group 2018)</w:t>
       </w:r>
       <w:r>
         <w:t xml:space="preserve">. They never ask whether that source type may issue that command to that resource. That is an application-layer question, and it is invisible at the transport layer by design.</w:t>
@@ -4043,9 +4004,6 @@
         <w:t xml:space="preserve"> </w:t>
       </w:r>
       <w:r>
-        <w:t xml:space="preserve">(Karim, Sitharaman, et al. 2026)</w:t>
-      </w:r>
-      <w:r>
         <w:t xml:space="preserve">. An operating system does not guarantee its own tail, and a control loop budgets for the tail.</w:t>
       </w:r>
     </w:p>
@@ -4068,16 +4026,10 @@
         <w:t xml:space="preserve"> </w:t>
       </w:r>
       <w:r>
-        <w:t xml:space="preserve">(Karim, Gupta, et al. 2026)</w:t>
-      </w:r>
-      <w:r>
         <w:t xml:space="preserve">, and an XACML OpenPDP deployment averaged roughly 50 ms</w:t>
       </w:r>
       <w:r>
         <w:t xml:space="preserve"> </w:t>
-      </w:r>
-      <w:r>
-        <w:t xml:space="preserve">(Karim, Sitharaman, et al. 2026; OASIS 2013)</w:t>
       </w:r>
       <w:r>
         <w:t xml:space="preserve">. These engines evaluate far richer policy than (2) expresses, and we do not fault their generality. We observe only that they occupy a latency regime three to five orders of magnitude above the closed form of (4), which is the regime that keeps authorization out of control paths.</w:t>
@@ -4399,9 +4351,6 @@
         <w:t xml:space="preserve"> </w:t>
       </w:r>
       <w:r>
-        <w:t xml:space="preserve">(InterNational Committee for Information Technology Standards 2020; Ferraiolo et al. 2011)</w:t>
-      </w:r>
-      <w:r>
         <w:t xml:space="preserve">. Open Policy Agent evaluates arbitrary conditions, thus</w:t>
       </w:r>
       <w:r>
@@ -4510,9 +4459,6 @@
         <w:t xml:space="preserve"> </w:t>
       </w:r>
       <w:r>
-        <w:t xml:space="preserve">(Open Policy Agent Project 2024; Karim, Gupta, et al. 2026)</w:t>
-      </w:r>
-      <w:r>
         <w:t xml:space="preserve">. XACML deployments we measured at roughly 50 ms earn</w:t>
       </w:r>
       <w:r>
@@ -4656,9 +4602,6 @@
         <w:t xml:space="preserve"> </w:t>
       </w:r>
       <w:r>
-        <w:t xml:space="preserve">(OASIS 2013)</w:t>
-      </w:r>
-      <w:r>
         <w:t xml:space="preserve">. SROS2 and DDS-Security authenticate identity at the transport layer and by design evaluate no application dimension, earning</w:t>
       </w:r>
       <w:r>
@@ -4735,9 +4678,6 @@
         <w:t xml:space="preserve"> </w:t>
       </w:r>
       <w:r>
-        <w:t xml:space="preserve">(Mayoral-Vilches et al. 2022; Object Management Group 2018)</w:t>
-      </w:r>
-      <w:r>
         <w:t xml:space="preserve">. CHERI enforces per-instruction memory capabilities in silicon and earns</w:t>
       </w:r>
       <w:r>
@@ -4887,18 +4827,6 @@
         <w:t xml:space="preserve"> </w:t>
       </w:r>
       <w:r>
-        <w:t xml:space="preserve">(</w:t>
-      </w:r>
-      <w:r>
-        <w:t xml:space="preserve">Watson et al.</w:t>
-      </w:r>
-      <w:r>
-        <w:t xml:space="preserve"> </w:t>
-      </w:r>
-      <w:r>
-        <w:t xml:space="preserve">2015)</w:t>
-      </w:r>
-      <w:r>
         <w:t xml:space="preserve">. In our own line, HyperNGAC performs batch privilege analysis over multi-cloud platforms and answers set-level questions in 0.12 s over 4</w:t>
       </w:r>
       <w:r>
@@ -4949,9 +4877,6 @@
         <w:t xml:space="preserve"> </w:t>
       </w:r>
       <w:r>
-        <w:t xml:space="preserve">(Sitharaman et al. 2025)</w:t>
-      </w:r>
-      <w:r>
         <w:t xml:space="preserve">. The DCAS H-NGAC baseline measured per-decision software latency on two platforms but synthesized no hardware, earning</w:t>
       </w:r>
       <w:r>
@@ -5095,9 +5020,6 @@
         <w:t xml:space="preserve"> </w:t>
       </w:r>
       <w:r>
-        <w:t xml:space="preserve">(Karim, Sitharaman, et al. 2026)</w:t>
-      </w:r>
-      <w:r>
         <w:t xml:space="preserve">. Time-scoped NGAC adds a temporal dimension in software with</w:t>
       </w:r>
       <w:r>
@@ -5239,9 +5161,6 @@
       </m:oMath>
       <w:r>
         <w:t xml:space="preserve"> </w:t>
-      </w:r>
-      <w:r>
-        <w:t xml:space="preserve">(Karim, Gupta, et al. 2026)</w:t>
       </w:r>
       <w:r>
         <w:t xml:space="preserve">.</w:t>
@@ -5402,7 +5321,7 @@
       </w:r>
     </w:p>
     <w:bookmarkEnd w:id="34"/>
-    <w:bookmarkStart w:id="55" w:name="future-work-and-conclusion"/>
+    <w:bookmarkStart w:id="35" w:name="future-work-and-conclusion"/>
     <w:p>
       <w:pPr>
         <w:pStyle w:val="Heading1"/>
@@ -5477,665 +5396,7 @@
         <w:t xml:space="preserve">059 legitimate commands. Robotics platform engineers and functional-safety engineers can treat the authorization worst case as a synthesis parameter, place the decision inside the control loop budget, and close the two attack classes that identity-based authorization admits. Layla’s interlock becomes a policy bit the fabric checks in bounded time, not a procedure she hopes the operator follows.</w:t>
       </w:r>
     </w:p>
-    <w:bookmarkStart w:id="54" w:name="refs"/>
-    <w:bookmarkStart w:id="35" w:name="ref-ferraiolo2011policymachine"/>
-    <w:p>
-      <w:pPr>
-        <w:pStyle w:val="Bibliography"/>
-      </w:pPr>
-      <w:r>
-        <w:t xml:space="preserve">Ferraiolo, David, Vijayalakshmi Atluri, and Serban Gavrila. 2011.</w:t>
-      </w:r>
-      <w:r>
-        <w:t xml:space="preserve"> </w:t>
-      </w:r>
-      <w:r>
-        <w:t xml:space="preserve">“The</w:t>
-      </w:r>
-      <w:r>
-        <w:t xml:space="preserve"> </w:t>
-      </w:r>
-      <w:r>
-        <w:t xml:space="preserve">Policy</w:t>
-      </w:r>
-      <w:r>
-        <w:t xml:space="preserve"> </w:t>
-      </w:r>
-      <w:r>
-        <w:t xml:space="preserve">Machine</w:t>
-      </w:r>
-      <w:r>
-        <w:t xml:space="preserve">: A Novel Architecture and Framework for Access Control Policy Specification and Enforcement.”</w:t>
-      </w:r>
-      <w:r>
-        <w:t xml:space="preserve"> </w:t>
-      </w:r>
-      <w:r>
-        <w:rPr>
-          <w:i/>
-          <w:iCs/>
-        </w:rPr>
-        <w:t xml:space="preserve">Journal of Systems Architecture</w:t>
-      </w:r>
-      <w:r>
-        <w:t xml:space="preserve"> </w:t>
-      </w:r>
-      <w:r>
-        <w:t xml:space="preserve">57 (4): 412–24.</w:t>
-      </w:r>
-    </w:p>
     <w:bookmarkEnd w:id="35"/>
-    <w:bookmarkStart w:id="36" w:name="ref-incits565"/>
-    <w:p>
-      <w:pPr>
-        <w:pStyle w:val="Bibliography"/>
-      </w:pPr>
-      <w:r>
-        <w:t xml:space="preserve">InterNational Committee for Information Technology Standards. 2020.</w:t>
-      </w:r>
-      <w:r>
-        <w:t xml:space="preserve"> </w:t>
-      </w:r>
-      <w:r>
-        <w:rPr>
-          <w:i/>
-          <w:iCs/>
-        </w:rPr>
-        <w:t xml:space="preserve">Information Technology — Next Generation Access Control (</w:t>
-      </w:r>
-      <w:r>
-        <w:rPr>
-          <w:i/>
-          <w:iCs/>
-        </w:rPr>
-        <w:t xml:space="preserve">NGAC</w:t>
-      </w:r>
-      <w:r>
-        <w:rPr>
-          <w:i/>
-          <w:iCs/>
-        </w:rPr>
-        <w:t xml:space="preserve">)</w:t>
-      </w:r>
-      <w:r>
-        <w:t xml:space="preserve">. INCITS 565-2020. ANSI/INCITS.</w:t>
-      </w:r>
-    </w:p>
-    <w:bookmarkEnd w:id="36"/>
-    <w:bookmarkStart w:id="37" w:name="ref-karim2026tsngac"/>
-    <w:p>
-      <w:pPr>
-        <w:pStyle w:val="Bibliography"/>
-      </w:pPr>
-      <w:r>
-        <w:t xml:space="preserve">Karim, Hassan, Deepti Gupta, and Sai Sitharaman. 2026.</w:t>
-      </w:r>
-      <w:r>
-        <w:t xml:space="preserve"> </w:t>
-      </w:r>
-      <w:r>
-        <w:t xml:space="preserve">“Deterministic Time-Scoped</w:t>
-      </w:r>
-      <w:r>
-        <w:t xml:space="preserve"> </w:t>
-      </w:r>
-      <w:r>
-        <w:t xml:space="preserve">NGAC</w:t>
-      </w:r>
-      <w:r>
-        <w:t xml:space="preserve"> </w:t>
-      </w:r>
-      <w:r>
-        <w:t xml:space="preserve">for Real-Time Multi-Robot Systems.”</w:t>
-      </w:r>
-      <w:r>
-        <w:t xml:space="preserve"> </w:t>
-      </w:r>
-      <w:r>
-        <w:t xml:space="preserve">Unpublished manuscript.</w:t>
-      </w:r>
-    </w:p>
-    <w:bookmarkEnd w:id="37"/>
-    <w:bookmarkStart w:id="39" w:name="ref-karim2026dcas"/>
-    <w:p>
-      <w:pPr>
-        <w:pStyle w:val="Bibliography"/>
-      </w:pPr>
-      <w:r>
-        <w:t xml:space="preserve">Karim, Hassan, Sai Sitharaman, and Deepti Gupta. 2026.</w:t>
-      </w:r>
-      <w:r>
-        <w:t xml:space="preserve"> </w:t>
-      </w:r>
-      <w:r>
-        <w:t xml:space="preserve">“Hardware-Accelerated</w:t>
-      </w:r>
-      <w:r>
-        <w:t xml:space="preserve"> </w:t>
-      </w:r>
-      <w:r>
-        <w:t xml:space="preserve">NGAC</w:t>
-      </w:r>
-      <w:r>
-        <w:t xml:space="preserve"> </w:t>
-      </w:r>
-      <w:r>
-        <w:t xml:space="preserve">Authorization for Real-Time Multi-Robot Systems.”</w:t>
-      </w:r>
-      <w:r>
-        <w:t xml:space="preserve"> </w:t>
-      </w:r>
-      <w:r>
-        <w:rPr>
-          <w:i/>
-          <w:iCs/>
-        </w:rPr>
-        <w:t xml:space="preserve">2026 IEEE 19th Dallas Circuits and Systems Conference (DCAS)</w:t>
-      </w:r>
-      <w:r>
-        <w:t xml:space="preserve">, 1–4.</w:t>
-      </w:r>
-      <w:r>
-        <w:t xml:space="preserve"> </w:t>
-      </w:r>
-      <w:hyperlink r:id="rId38">
-        <w:r>
-          <w:rPr>
-            <w:rStyle w:val="Hyperlink"/>
-          </w:rPr>
-          <w:t xml:space="preserve">https://doi.org/10.1109/dcas69364.2026.11544855</w:t>
-        </w:r>
-      </w:hyperlink>
-      <w:r>
-        <w:t xml:space="preserve">.</w:t>
-      </w:r>
-    </w:p>
-    <w:bookmarkEnd w:id="39"/>
-    <w:bookmarkStart w:id="40" w:name="ref-mayoralvilches2022sros2"/>
-    <w:p>
-      <w:pPr>
-        <w:pStyle w:val="Bibliography"/>
-      </w:pPr>
-      <w:r>
-        <w:t xml:space="preserve">Mayoral-Vilches, Víctor, Ruffin White, Gianluca Caiazza, and Mikael Arguedas. 2022.</w:t>
-      </w:r>
-      <w:r>
-        <w:t xml:space="preserve"> </w:t>
-      </w:r>
-      <w:r>
-        <w:t xml:space="preserve">“</w:t>
-      </w:r>
-      <w:r>
-        <w:t xml:space="preserve">SROS2</w:t>
-      </w:r>
-      <w:r>
-        <w:t xml:space="preserve">: Usable Cyber Security Tools for</w:t>
-      </w:r>
-      <w:r>
-        <w:t xml:space="preserve"> </w:t>
-      </w:r>
-      <w:r>
-        <w:t xml:space="preserve">ROS</w:t>
-      </w:r>
-      <w:r>
-        <w:t xml:space="preserve"> </w:t>
-      </w:r>
-      <w:r>
-        <w:t xml:space="preserve">2.”</w:t>
-      </w:r>
-      <w:r>
-        <w:t xml:space="preserve"> </w:t>
-      </w:r>
-      <w:r>
-        <w:rPr>
-          <w:i/>
-          <w:iCs/>
-        </w:rPr>
-        <w:t xml:space="preserve">2022 IEEE/RSJ International Conference on Intelligent Robots and Systems (IROS)</w:t>
-      </w:r>
-      <w:r>
-        <w:t xml:space="preserve">.</w:t>
-      </w:r>
-    </w:p>
-    <w:bookmarkEnd w:id="40"/>
-    <w:bookmarkStart w:id="42" w:name="ref-cve202138425"/>
-    <w:p>
-      <w:pPr>
-        <w:pStyle w:val="Bibliography"/>
-      </w:pPr>
-      <w:r>
-        <w:t xml:space="preserve">National Vulnerability Database. 2021.</w:t>
-      </w:r>
-      <w:r>
-        <w:t xml:space="preserve"> </w:t>
-      </w:r>
-      <w:r>
-        <w:rPr>
-          <w:i/>
-          <w:iCs/>
-        </w:rPr>
-        <w:t xml:space="preserve">CVE-2021-38425</w:t>
-      </w:r>
-      <w:r>
-        <w:rPr>
-          <w:i/>
-          <w:iCs/>
-        </w:rPr>
-        <w:t xml:space="preserve">:</w:t>
-      </w:r>
-      <w:r>
-        <w:rPr>
-          <w:i/>
-          <w:iCs/>
-        </w:rPr>
-        <w:t xml:space="preserve"> </w:t>
-      </w:r>
-      <w:r>
-        <w:rPr>
-          <w:i/>
-          <w:iCs/>
-        </w:rPr>
-        <w:t xml:space="preserve">eProsima</w:t>
-      </w:r>
-      <w:r>
-        <w:rPr>
-          <w:i/>
-          <w:iCs/>
-        </w:rPr>
-        <w:t xml:space="preserve"> </w:t>
-      </w:r>
-      <w:r>
-        <w:rPr>
-          <w:i/>
-          <w:iCs/>
-        </w:rPr>
-        <w:t xml:space="preserve">Fast</w:t>
-      </w:r>
-      <w:r>
-        <w:rPr>
-          <w:i/>
-          <w:iCs/>
-        </w:rPr>
-        <w:t xml:space="preserve"> </w:t>
-      </w:r>
-      <w:r>
-        <w:rPr>
-          <w:i/>
-          <w:iCs/>
-        </w:rPr>
-        <w:t xml:space="preserve">DDS</w:t>
-      </w:r>
-      <w:r>
-        <w:rPr>
-          <w:i/>
-          <w:iCs/>
-        </w:rPr>
-        <w:t xml:space="preserve"> </w:t>
-      </w:r>
-      <w:r>
-        <w:rPr>
-          <w:i/>
-          <w:iCs/>
-        </w:rPr>
-        <w:t xml:space="preserve">RTPS</w:t>
-      </w:r>
-      <w:r>
-        <w:rPr>
-          <w:i/>
-          <w:iCs/>
-        </w:rPr>
-        <w:t xml:space="preserve"> </w:t>
-      </w:r>
-      <w:r>
-        <w:rPr>
-          <w:i/>
-          <w:iCs/>
-        </w:rPr>
-        <w:t xml:space="preserve">Message Injection</w:t>
-      </w:r>
-      <w:r>
-        <w:t xml:space="preserve">.</w:t>
-      </w:r>
-      <w:r>
-        <w:t xml:space="preserve"> </w:t>
-      </w:r>
-      <w:hyperlink r:id="rId41">
-        <w:r>
-          <w:rPr>
-            <w:rStyle w:val="Hyperlink"/>
-          </w:rPr>
-          <w:t xml:space="preserve">Https://nvd.nist.gov/vuln/detail/CVE-2021-38425</w:t>
-        </w:r>
-      </w:hyperlink>
-      <w:r>
-        <w:t xml:space="preserve">.</w:t>
-      </w:r>
-    </w:p>
-    <w:bookmarkEnd w:id="42"/>
-    <w:bookmarkStart w:id="44" w:name="ref-cve202233323"/>
-    <w:p>
-      <w:pPr>
-        <w:pStyle w:val="Bibliography"/>
-      </w:pPr>
-      <w:r>
-        <w:t xml:space="preserve">National Vulnerability Database. 2022a.</w:t>
-      </w:r>
-      <w:r>
-        <w:t xml:space="preserve"> </w:t>
-      </w:r>
-      <w:r>
-        <w:rPr>
-          <w:i/>
-          <w:iCs/>
-        </w:rPr>
-        <w:t xml:space="preserve">CVE-2022-33323</w:t>
-      </w:r>
-      <w:r>
-        <w:rPr>
-          <w:i/>
-          <w:iCs/>
-        </w:rPr>
-        <w:t xml:space="preserve">: Mitsubishi Electric</w:t>
-      </w:r>
-      <w:r>
-        <w:rPr>
-          <w:i/>
-          <w:iCs/>
-        </w:rPr>
-        <w:t xml:space="preserve"> </w:t>
-      </w:r>
-      <w:r>
-        <w:rPr>
-          <w:i/>
-          <w:iCs/>
-        </w:rPr>
-        <w:t xml:space="preserve">MELFA</w:t>
-      </w:r>
-      <w:r>
-        <w:rPr>
-          <w:i/>
-          <w:iCs/>
-        </w:rPr>
-        <w:t xml:space="preserve"> </w:t>
-      </w:r>
-      <w:r>
-        <w:rPr>
-          <w:i/>
-          <w:iCs/>
-        </w:rPr>
-        <w:t xml:space="preserve">Unauthorized Command Execution</w:t>
-      </w:r>
-      <w:r>
-        <w:t xml:space="preserve">.</w:t>
-      </w:r>
-      <w:r>
-        <w:t xml:space="preserve"> </w:t>
-      </w:r>
-      <w:hyperlink r:id="rId43">
-        <w:r>
-          <w:rPr>
-            <w:rStyle w:val="Hyperlink"/>
-          </w:rPr>
-          <w:t xml:space="preserve">Https://nvd.nist.gov/vuln/detail/CVE-2022-33323</w:t>
-        </w:r>
-      </w:hyperlink>
-      <w:r>
-        <w:t xml:space="preserve">.</w:t>
-      </w:r>
-    </w:p>
-    <w:bookmarkEnd w:id="44"/>
-    <w:bookmarkStart w:id="46" w:name="ref-cve202245789"/>
-    <w:p>
-      <w:pPr>
-        <w:pStyle w:val="Bibliography"/>
-      </w:pPr>
-      <w:r>
-        <w:t xml:space="preserve">National Vulnerability Database. 2022b.</w:t>
-      </w:r>
-      <w:r>
-        <w:t xml:space="preserve"> </w:t>
-      </w:r>
-      <w:r>
-        <w:rPr>
-          <w:i/>
-          <w:iCs/>
-        </w:rPr>
-        <w:t xml:space="preserve">CVE-2022-45789</w:t>
-      </w:r>
-      <w:r>
-        <w:rPr>
-          <w:i/>
-          <w:iCs/>
-        </w:rPr>
-        <w:t xml:space="preserve">: Schneider Electric Modicon Session Hijack</w:t>
-      </w:r>
-      <w:r>
-        <w:t xml:space="preserve">.</w:t>
-      </w:r>
-      <w:r>
-        <w:t xml:space="preserve"> </w:t>
-      </w:r>
-      <w:hyperlink r:id="rId45">
-        <w:r>
-          <w:rPr>
-            <w:rStyle w:val="Hyperlink"/>
-          </w:rPr>
-          <w:t xml:space="preserve">Https://nvd.nist.gov/vuln/detail/CVE-2022-45789</w:t>
-        </w:r>
-      </w:hyperlink>
-      <w:r>
-        <w:t xml:space="preserve">.</w:t>
-      </w:r>
-    </w:p>
-    <w:bookmarkEnd w:id="46"/>
-    <w:bookmarkStart w:id="47" w:name="ref-oasisxacml"/>
-    <w:p>
-      <w:pPr>
-        <w:pStyle w:val="Bibliography"/>
-      </w:pPr>
-      <w:r>
-        <w:t xml:space="preserve">OASIS. 2013.</w:t>
-      </w:r>
-      <w:r>
-        <w:t xml:space="preserve"> </w:t>
-      </w:r>
-      <w:r>
-        <w:rPr>
-          <w:i/>
-          <w:iCs/>
-        </w:rPr>
-        <w:t xml:space="preserve">eXtensible</w:t>
-      </w:r>
-      <w:r>
-        <w:rPr>
-          <w:i/>
-          <w:iCs/>
-        </w:rPr>
-        <w:t xml:space="preserve"> </w:t>
-      </w:r>
-      <w:r>
-        <w:rPr>
-          <w:i/>
-          <w:iCs/>
-        </w:rPr>
-        <w:t xml:space="preserve">Access Control Markup Language (</w:t>
-      </w:r>
-      <w:r>
-        <w:rPr>
-          <w:i/>
-          <w:iCs/>
-        </w:rPr>
-        <w:t xml:space="preserve">XACML</w:t>
-      </w:r>
-      <w:r>
-        <w:rPr>
-          <w:i/>
-          <w:iCs/>
-        </w:rPr>
-        <w:t xml:space="preserve">) Version 3.0</w:t>
-      </w:r>
-      <w:r>
-        <w:t xml:space="preserve">. OASIS Standard.</w:t>
-      </w:r>
-    </w:p>
-    <w:bookmarkEnd w:id="47"/>
-    <w:bookmarkStart w:id="48" w:name="ref-omgddssec"/>
-    <w:p>
-      <w:pPr>
-        <w:pStyle w:val="Bibliography"/>
-      </w:pPr>
-      <w:r>
-        <w:t xml:space="preserve">Object Management Group. 2018.</w:t>
-      </w:r>
-      <w:r>
-        <w:t xml:space="preserve"> </w:t>
-      </w:r>
-      <w:r>
-        <w:rPr>
-          <w:i/>
-          <w:iCs/>
-        </w:rPr>
-        <w:t xml:space="preserve">DDS</w:t>
-      </w:r>
-      <w:r>
-        <w:rPr>
-          <w:i/>
-          <w:iCs/>
-        </w:rPr>
-        <w:t xml:space="preserve"> </w:t>
-      </w:r>
-      <w:r>
-        <w:rPr>
-          <w:i/>
-          <w:iCs/>
-        </w:rPr>
-        <w:t xml:space="preserve">Security Specification, Version 1.1</w:t>
-      </w:r>
-      <w:r>
-        <w:t xml:space="preserve">. OMG.</w:t>
-      </w:r>
-    </w:p>
-    <w:bookmarkEnd w:id="48"/>
-    <w:bookmarkStart w:id="50" w:name="ref-opa"/>
-    <w:p>
-      <w:pPr>
-        <w:pStyle w:val="Bibliography"/>
-      </w:pPr>
-      <w:r>
-        <w:t xml:space="preserve">Open Policy Agent Project. 2024.</w:t>
-      </w:r>
-      <w:r>
-        <w:t xml:space="preserve"> </w:t>
-      </w:r>
-      <w:r>
-        <w:rPr>
-          <w:i/>
-          <w:iCs/>
-        </w:rPr>
-        <w:t xml:space="preserve">Open Policy Agent</w:t>
-      </w:r>
-      <w:r>
-        <w:t xml:space="preserve">.</w:t>
-      </w:r>
-      <w:r>
-        <w:t xml:space="preserve"> </w:t>
-      </w:r>
-      <w:hyperlink r:id="rId49">
-        <w:r>
-          <w:rPr>
-            <w:rStyle w:val="Hyperlink"/>
-          </w:rPr>
-          <w:t xml:space="preserve">Https://www.openpolicyagent.org</w:t>
-        </w:r>
-      </w:hyperlink>
-      <w:r>
-        <w:t xml:space="preserve">.</w:t>
-      </w:r>
-    </w:p>
-    <w:bookmarkEnd w:id="50"/>
-    <w:bookmarkStart w:id="52" w:name="ref-sitharaman2025hypergraph"/>
-    <w:p>
-      <w:pPr>
-        <w:pStyle w:val="Bibliography"/>
-      </w:pPr>
-      <w:r>
-        <w:t xml:space="preserve">Sitharaman, Sai, Hassan Karim, Deepti Gupta, and Manoj Tyagi. 2025.</w:t>
-      </w:r>
-      <w:r>
-        <w:t xml:space="preserve"> </w:t>
-      </w:r>
-      <w:r>
-        <w:t xml:space="preserve">“Scalable Privilege Analysis for Multi-Cloud Big Data Platforms: A Hypergraph Approach.”</w:t>
-      </w:r>
-      <w:r>
-        <w:t xml:space="preserve"> </w:t>
-      </w:r>
-      <w:r>
-        <w:rPr>
-          <w:i/>
-          <w:iCs/>
-        </w:rPr>
-        <w:t xml:space="preserve">2025 IEEE International Conference on Big Data (BigData)</w:t>
-      </w:r>
-      <w:r>
-        <w:t xml:space="preserve">, 6626–33.</w:t>
-      </w:r>
-      <w:r>
-        <w:t xml:space="preserve"> </w:t>
-      </w:r>
-      <w:hyperlink r:id="rId51">
-        <w:r>
-          <w:rPr>
-            <w:rStyle w:val="Hyperlink"/>
-          </w:rPr>
-          <w:t xml:space="preserve">https://doi.org/10.1109/bigdata66926.2025.11401728</w:t>
-        </w:r>
-      </w:hyperlink>
-      <w:r>
-        <w:t xml:space="preserve">.</w:t>
-      </w:r>
-    </w:p>
-    <w:bookmarkEnd w:id="52"/>
-    <w:bookmarkStart w:id="53" w:name="ref-watson2015cheri"/>
-    <w:p>
-      <w:pPr>
-        <w:pStyle w:val="Bibliography"/>
-      </w:pPr>
-      <w:r>
-        <w:t xml:space="preserve">Watson, Robert N. M., Jonathan Woodruff, Peter G. Neumann, Simon W. Moore, et al.</w:t>
-      </w:r>
-      <w:r>
-        <w:t xml:space="preserve"> 2015.</w:t>
-      </w:r>
-      <w:r>
-        <w:t xml:space="preserve"> </w:t>
-      </w:r>
-      <w:r>
-        <w:t xml:space="preserve">“</w:t>
-      </w:r>
-      <w:r>
-        <w:t xml:space="preserve">CHERI</w:t>
-      </w:r>
-      <w:r>
-        <w:t xml:space="preserve">: A Hybrid Capability-System Architecture for Scalable Software Compartmentalization.”</w:t>
-      </w:r>
-      <w:r>
-        <w:t xml:space="preserve"> </w:t>
-      </w:r>
-      <w:r>
-        <w:rPr>
-          <w:i/>
-          <w:iCs/>
-        </w:rPr>
-        <w:t xml:space="preserve">2015 IEEE Symposium on Security and Privacy</w:t>
-      </w:r>
-      <w:r>
-        <w:t xml:space="preserve">.</w:t>
-      </w:r>
-    </w:p>
-    <w:bookmarkEnd w:id="53"/>
-    <w:bookmarkEnd w:id="54"/>
-    <w:bookmarkEnd w:id="55"/>
     <w:sectPr>
       <w:footnotePr>
         <w:numRestart w:val="eachSect"/>

</xml_diff>